<commit_message>
Sync the kit from GLOW: Accessibility Agents 7.1, the new block order
Synced with scripts/sync_ahg_repo.py from Community-Access/glow at b7529e7
(PR #142). agents/ and practice/ are untouched.

Co-Authored-By: Claude Opus 5.5 <noreply@anthropic.com>
Claude-Session: https://claude.ai/code/session_01PmRBrUTuhzYnQBFxUCN6Vr
</commit_message>
<xml_diff>
--- a/kit/step-cards/2-design-your-agent.docx
+++ b/kit/step-cards/2-design-your-agent.docx
@@ -12,7 +12,7 @@
     </w:p>
     <w:p>
       <w:r>
-        <w:t>Block 2 of 7, 10:50 to 11:50.</w:t>
+        <w:t>Block 2 of 7, 10:50 to 11:40.</w:t>
       </w:r>
     </w:p>
     <w:p>
@@ -25,7 +25,7 @@
     </w:p>
     <w:p>
       <w:r>
-        <w:t>Step 2 of 7: your agent, as five plain-English answers.</w:t>
+        <w:t>Step 2 of 7: your agent, as six plain-English answers.</w:t>
       </w:r>
     </w:p>
     <w:p>
@@ -114,7 +114,7 @@
         </w:numPr>
       </w:pPr>
       <w:r>
-        <w:t>Answer your assistant's questions one at a time: your role card and problem, then role, task, trusted guidance, output format and human review, then your name and institution. Borrow from the example whenever you like.</w:t>
+        <w:t>Answer your assistant's questions one at a time: your role card and problem, then role, task, trusted guidance, output format, an example of a good answer and human review, then your name and institution. Borrow from the example whenever you like.</w:t>
       </w:r>
     </w:p>
     <w:p>
@@ -182,7 +182,7 @@
         </w:numPr>
       </w:pPr>
       <w:r>
-        <w:t>Answer Copilot's questions one at a time: role, task, trusted guidance, output format, human review. Borrow from the example whenever you like.</w:t>
+        <w:t>Answer Copilot's questions one at a time: role, task, trusted guidance, output format, an example of a good answer, human review. Borrow from the example whenever you like.</w:t>
       </w:r>
     </w:p>
     <w:p>

</xml_diff>

<commit_message>
Sync the kit from GLOW: Accessibility Agents 7.1, the new block order (#4)
Synced with scripts/sync_ahg_repo.py from Community-Access/glow at b7529e7
(PR #142). agents/ and practice/ are untouched.


Claude-Session: https://claude.ai/code/session_01PmRBrUTuhzYnQBFxUCN6Vr

Co-authored-by: Claude <noreply@anthropic.com>
</commit_message>
<xml_diff>
--- a/kit/step-cards/2-design-your-agent.docx
+++ b/kit/step-cards/2-design-your-agent.docx
@@ -12,7 +12,7 @@
     </w:p>
     <w:p>
       <w:r>
-        <w:t>Block 2 of 7, 10:50 to 11:50.</w:t>
+        <w:t>Block 2 of 7, 10:50 to 11:40.</w:t>
       </w:r>
     </w:p>
     <w:p>
@@ -25,7 +25,7 @@
     </w:p>
     <w:p>
       <w:r>
-        <w:t>Step 2 of 7: your agent, as five plain-English answers.</w:t>
+        <w:t>Step 2 of 7: your agent, as six plain-English answers.</w:t>
       </w:r>
     </w:p>
     <w:p>
@@ -114,7 +114,7 @@
         </w:numPr>
       </w:pPr>
       <w:r>
-        <w:t>Answer your assistant's questions one at a time: your role card and problem, then role, task, trusted guidance, output format and human review, then your name and institution. Borrow from the example whenever you like.</w:t>
+        <w:t>Answer your assistant's questions one at a time: your role card and problem, then role, task, trusted guidance, output format, an example of a good answer and human review, then your name and institution. Borrow from the example whenever you like.</w:t>
       </w:r>
     </w:p>
     <w:p>
@@ -182,7 +182,7 @@
         </w:numPr>
       </w:pPr>
       <w:r>
-        <w:t>Answer Copilot's questions one at a time: role, task, trusted guidance, output format, human review. Borrow from the example whenever you like.</w:t>
+        <w:t>Answer Copilot's questions one at a time: role, task, trusted guidance, output format, an example of a good answer, human review. Borrow from the example whenever you like.</w:t>
       </w:r>
     </w:p>
     <w:p>

</xml_diff>